<commit_message>
Updating DJFMP with 2026 data
</commit_message>
<xml_diff>
--- a/publication/metadata_templates/methods.docx
+++ b/publication/metadata_templates/methods.docx
@@ -834,15 +834,7 @@
         <w:t>.</w:t>
       </w:r>
       <w:r>
-        <w:t xml:space="preserve"> Hartman. 2023. discretewq: An Integrated Dataset of Discrete Water Quality in the San Francisco Estuary v2.4.0. </w:t>
-      </w:r>
-      <w:proofErr w:type="spellStart"/>
-      <w:r>
-        <w:t>Zenodo</w:t>
-      </w:r>
-      <w:proofErr w:type="spellEnd"/>
-      <w:r>
-        <w:t xml:space="preserve">. </w:t>
+        <w:t xml:space="preserve"> Hartman. 2023. discretewq: An Integrated Dataset of Discrete Water Quality in the San Francisco Estuary v2.4.0. Zenodo. </w:t>
       </w:r>
       <w:r>
         <w:t>d</w:t>
@@ -1288,19 +1280,19 @@
     <w:p/>
     <w:p>
       <w:r>
-        <w:t>United States Fish and Wildlife Service, J. Speegle, C. Macfarlane, E. Huber, D. Goodman, K. Erly, and R. Cook. 2026.</w:t>
+        <w:t>United States Fish and Wildlife Service, J. Speegle, J. Falcon, C. Macfarlane, K. Erly, S. Yun, A. Nanninga, and E. Huber. 2026.</w:t>
       </w:r>
       <w:r>
         <w:t xml:space="preserve"> </w:t>
       </w:r>
       <w:r>
-        <w:t>Interagency Ecological Program: Over four decades of juvenile fish monitoring data from the San Francisco Estuary, collected</w:t>
+        <w:t>Interagency Ecological Program: Over four decades of juvenile fish monitoring data from the San Francisco Estuary, collected by</w:t>
       </w:r>
       <w:r>
         <w:t xml:space="preserve"> </w:t>
       </w:r>
       <w:r>
-        <w:t xml:space="preserve">by the Delta Juvenile Fish Monitoring Program, 1976-2025 </w:t>
+        <w:t xml:space="preserve">the Delta Juvenile Fish Monitoring Program, 1976-2026 </w:t>
       </w:r>
       <w:proofErr w:type="spellStart"/>
       <w:r>
@@ -1308,13 +1300,12 @@
       </w:r>
       <w:proofErr w:type="spellEnd"/>
       <w:r>
-        <w:t xml:space="preserve"> 14. Environmental Data Initiative.</w:t>
-      </w:r>
-      <w:r>
-        <w:t xml:space="preserve"> </w:t>
-      </w:r>
-      <w:r>
-        <w:t>https://doi.org/10.6073/pasta/ad35c80cafd87ba928d3f37fa124ccaf</w:t>
+        <w:t xml:space="preserve"> 17. Environmental Data Initiative.</w:t>
+      </w:r>
+    </w:p>
+    <w:p>
+      <w:r>
+        <w:t>https://doi.org/10.6073/pasta/c620f8300a051ed8d7037c1f0e046b7e</w:t>
       </w:r>
       <w:r>
         <w:t>.</w:t>

</xml_diff>

<commit_message>
Updating NCRO with 2025 data
</commit_message>
<xml_diff>
--- a/publication/metadata_templates/methods.docx
+++ b/publication/metadata_templates/methods.docx
@@ -52,15 +52,7 @@
         <w:t>/discretewq</w:t>
       </w:r>
       <w:r>
-        <w:t xml:space="preserve"> (</w:t>
-      </w:r>
-      <w:proofErr w:type="spellStart"/>
-      <w:r>
-        <w:t>Bashevkin</w:t>
-      </w:r>
-      <w:proofErr w:type="spellEnd"/>
-      <w:r>
-        <w:t xml:space="preserve"> </w:t>
+        <w:t xml:space="preserve"> (Bashevkin </w:t>
       </w:r>
       <w:r>
         <w:t>et al.</w:t>
@@ -90,29 +82,13 @@
         <w:t>Ten</w:t>
       </w:r>
       <w:r>
-        <w:t xml:space="preserve"> surveys are primarily focused on collecting fish abundance data but collect water quality data alongside fish samples. These include the California Department of Fish and Wildlife (CDFW) Fall Midwater Trawl (FMWT), CDFW Summer </w:t>
-      </w:r>
-      <w:proofErr w:type="spellStart"/>
-      <w:r>
-        <w:t>Townet</w:t>
-      </w:r>
-      <w:proofErr w:type="spellEnd"/>
-      <w:r>
-        <w:t xml:space="preserve"> Survey (STN), CDFW Spring Kodiak Trawl (SKT), CDFW 20-mm Survey (20mm), CDFW San Francisco Bay Study (</w:t>
-      </w:r>
-      <w:proofErr w:type="spellStart"/>
-      <w:r>
-        <w:t>Bay</w:t>
+        <w:t xml:space="preserve"> surveys are primarily focused on collecting fish abundance data but collect water quality data alongside fish samples. These include the California Department of Fish and Wildlife (CDFW) Fall Midwater Trawl (FMWT), CDFW Summer Townet Survey (STN), CDFW Spring Kodiak Trawl (SKT), CDFW 20-mm Survey (20mm), CDFW San Francisco Bay Study (Bay</w:t>
       </w:r>
       <w:r>
         <w:t>s</w:t>
       </w:r>
       <w:r>
-        <w:t>tudy</w:t>
-      </w:r>
-      <w:proofErr w:type="spellEnd"/>
-      <w:r>
-        <w:t xml:space="preserve">), </w:t>
+        <w:t xml:space="preserve">tudy), </w:t>
       </w:r>
       <w:r>
         <w:t xml:space="preserve">CDFW Smelt Larva Survey (SLS), California Department of Water Resources (DWR) Yolo Bypass Fish Monitoring Program (YBFMP), </w:t>
@@ -309,15 +285,7 @@
       </w:r>
       <w:r>
         <w:lastRenderedPageBreak/>
-        <w:t xml:space="preserve">Nutrient samples were sometimes collected deeper than the surface water quality data. In these cases, we selected the shallowest nutrient data available. The maximum depth of surface nutrient data is 4 </w:t>
-      </w:r>
-      <w:proofErr w:type="gramStart"/>
-      <w:r>
-        <w:t>m</w:t>
-      </w:r>
-      <w:proofErr w:type="gramEnd"/>
-      <w:r>
-        <w:t xml:space="preserve"> and these depths are available in the dataset. </w:t>
+        <w:t xml:space="preserve">Nutrient samples were sometimes collected deeper than the surface water quality data. In these cases, we selected the shallowest nutrient data available. The maximum depth of surface nutrient data is 4 m and these depths are available in the dataset. </w:t>
       </w:r>
       <w:r>
         <w:t xml:space="preserve">Bottom temperature </w:t>
@@ -355,15 +323,7 @@
         <w:ind w:firstLine="720"/>
       </w:pPr>
       <w:r>
-        <w:t xml:space="preserve">While all surveys now measure water temperature with digital sensors, older surveys used less precise handheld thermometers in earlier years. More precise sensors were first used by FMWT in 1995, STN in 1994, and DJFMP in 2014. All other surveys </w:t>
-      </w:r>
-      <w:proofErr w:type="gramStart"/>
-      <w:r>
-        <w:t>used</w:t>
-      </w:r>
-      <w:proofErr w:type="gramEnd"/>
-      <w:r>
-        <w:t xml:space="preserve"> more precise methods to measure temperature since inception. SKT had notes on some temperature records that they transcribed from a different monitoring program (CDEC)</w:t>
+        <w:t>While all surveys now measure water temperature with digital sensors, older surveys used less precise handheld thermometers in earlier years. More precise sensors were first used by FMWT in 1995, STN in 1994, and DJFMP in 2014. All other surveys used more precise methods to measure temperature since inception. SKT had notes on some temperature records that they transcribed from a different monitoring program (CDEC)</w:t>
       </w:r>
       <w:r>
         <w:t>,</w:t>
@@ -490,15 +450,7 @@
         <w:t>Microcystis</w:t>
       </w:r>
       <w:r>
-        <w:t xml:space="preserve"> presence in zooplankton net cod-ends. Outside this short </w:t>
-      </w:r>
-      <w:proofErr w:type="gramStart"/>
-      <w:r>
-        <w:t>time period</w:t>
-      </w:r>
-      <w:proofErr w:type="gramEnd"/>
-      <w:r>
-        <w:t>, this was measured as a “low” on the 5-point scale, so all records of this 6</w:t>
+        <w:t xml:space="preserve"> presence in zooplankton net cod-ends. Outside this short time period, this was measured as a “low” on the 5-point scale, so all records of this 6</w:t>
       </w:r>
       <w:r>
         <w:rPr>
@@ -583,15 +535,7 @@
         <w:t xml:space="preserve"> </w:t>
       </w:r>
       <w:r>
-        <w:t xml:space="preserve">calibrated these field measurements with filtered water samples collected and analyzed </w:t>
-      </w:r>
-      <w:proofErr w:type="gramStart"/>
-      <w:r>
-        <w:t>similar to</w:t>
-      </w:r>
-      <w:proofErr w:type="gramEnd"/>
-      <w:r>
-        <w:t xml:space="preserve"> EMP</w:t>
+        <w:t>calibrated these field measurements with filtered water samples collected and analyzed similar to EMP</w:t>
       </w:r>
       <w:r>
         <w:t xml:space="preserve"> and NCRO</w:t>
@@ -690,39 +634,7 @@
         <w:ind w:firstLine="720"/>
       </w:pPr>
       <w:r>
-        <w:t xml:space="preserve">From each dataset, we selected columns corresponding to the water quality variables of interest as well as important accessory information (date, time, station, latitude, longitude, depth, tide, and any notes). We then renamed variables for consistency and converted all variables to consistent units. Salinity was calculated from specific conductivity using the ec2pss function from the </w:t>
-      </w:r>
-      <w:proofErr w:type="spellStart"/>
-      <w:r>
-        <w:t>wql</w:t>
-      </w:r>
-      <w:proofErr w:type="spellEnd"/>
-      <w:r>
-        <w:t xml:space="preserve"> R package (</w:t>
-      </w:r>
-      <w:proofErr w:type="spellStart"/>
-      <w:r>
-        <w:t>Jassby</w:t>
-      </w:r>
-      <w:proofErr w:type="spellEnd"/>
-      <w:r>
-        <w:t xml:space="preserve"> et al. 2017). This function uses the Practical Salinity Scale 1978 for salinities between 2 and 42 (</w:t>
-      </w:r>
-      <w:proofErr w:type="spellStart"/>
-      <w:r>
-        <w:t>Fofonoff</w:t>
-      </w:r>
-      <w:proofErr w:type="spellEnd"/>
-      <w:r>
-        <w:t xml:space="preserve"> and Millard Jr 1983) and the extension of the Practical Salinity Scale (Hill et al. 1986) for salinities below 2. Conductivity data </w:t>
-      </w:r>
-      <w:proofErr w:type="gramStart"/>
-      <w:r>
-        <w:t>were</w:t>
-      </w:r>
-      <w:proofErr w:type="gramEnd"/>
-      <w:r>
-        <w:t xml:space="preserve"> also retained in the integrated dataset. In most cases, latitude and longitude coordinates of the fixed sampling stations were retained. When these coordinates were not available (e.g.</w:t>
+        <w:t>From each dataset, we selected columns corresponding to the water quality variables of interest as well as important accessory information (date, time, station, latitude, longitude, depth, tide, and any notes). We then renamed variables for consistency and converted all variables to consistent units. Salinity was calculated from specific conductivity using the ec2pss function from the wql R package (Jassby et al. 2017). This function uses the Practical Salinity Scale 1978 for salinities between 2 and 42 (Fofonoff and Millard Jr 1983) and the extension of the Practical Salinity Scale (Hill et al. 1986) for salinities below 2. Conductivity data were also retained in the integrated dataset. In most cases, latitude and longitude coordinates of the fixed sampling stations were retained. When these coordinates were not available (e.g.</w:t>
       </w:r>
       <w:r>
         <w:t>,</w:t>
@@ -763,21 +675,16 @@
       <w:r>
         <w:t xml:space="preserve">; </w:t>
       </w:r>
-      <w:proofErr w:type="spellStart"/>
-      <w:r>
-        <w:t>Bashevkin</w:t>
-      </w:r>
-      <w:proofErr w:type="spellEnd"/>
+      <w:r>
+        <w:t xml:space="preserve">Bashevkin </w:t>
+      </w:r>
+      <w:r>
+        <w:t>et al.</w:t>
+      </w:r>
       <w:r>
         <w:t xml:space="preserve"> </w:t>
       </w:r>
       <w:r>
-        <w:t>et al.</w:t>
-      </w:r>
-      <w:r>
-        <w:t xml:space="preserve"> </w:t>
-      </w:r>
-      <w:r>
         <w:t>202</w:t>
       </w:r>
       <w:r>
@@ -795,13 +702,8 @@
     </w:p>
     <w:p/>
     <w:p>
-      <w:proofErr w:type="spellStart"/>
-      <w:r>
-        <w:t>Bashevkin</w:t>
-      </w:r>
-      <w:proofErr w:type="spellEnd"/>
-      <w:r>
-        <w:t>, S. M.</w:t>
+      <w:r>
+        <w:t>Bashevkin, S. M.</w:t>
       </w:r>
       <w:r>
         <w:t>, D</w:t>
@@ -870,23 +772,7 @@
     <w:p/>
     <w:p>
       <w:r>
-        <w:t xml:space="preserve">Jassby, A. D., J. E. </w:t>
-      </w:r>
-      <w:proofErr w:type="spellStart"/>
-      <w:r>
-        <w:t>Cloern</w:t>
-      </w:r>
-      <w:proofErr w:type="spellEnd"/>
-      <w:r>
-        <w:t xml:space="preserve">, and J. Stachelek. 2017. </w:t>
-      </w:r>
-      <w:proofErr w:type="spellStart"/>
-      <w:r>
-        <w:t>wql</w:t>
-      </w:r>
-      <w:proofErr w:type="spellEnd"/>
-      <w:r>
-        <w:t>: Exploring Water Quality Monitoring Data.</w:t>
+        <w:t>Jassby, A. D., J. E. Cloern, and J. Stachelek. 2017. wql: Exploring Water Quality Monitoring Data.</w:t>
       </w:r>
     </w:p>
     <w:p/>
@@ -911,104 +797,85 @@
     <w:p/>
     <w:p>
       <w:r>
-        <w:t xml:space="preserve">Battey, M. and S. Perry. 2023. Interagency Ecological Program: Discrete water quality monitoring in the Sacramento-San Joaquin Bay-Delta, collected by the Environmental Monitoring Program, 1975-2022 </w:t>
-      </w:r>
-      <w:proofErr w:type="spellStart"/>
-      <w:r>
-        <w:t>ver</w:t>
-      </w:r>
-      <w:proofErr w:type="spellEnd"/>
+        <w:t xml:space="preserve">Battey, M. and S. Perry. 2023. Interagency Ecological Program: Discrete water quality monitoring in the Sacramento-San Joaquin Bay-Delta, collected by the Environmental Monitoring Program, 1975-2022 ver </w:t>
+      </w:r>
+      <w:r>
+        <w:t>9</w:t>
+      </w:r>
+      <w:r>
+        <w:t>. Environmental Data Initiative. [</w:t>
+      </w:r>
+      <w:r>
+        <w:t>doi:10.6073/pasta/a306956e3ebdc78348c2df8d05cd2ccb</w:t>
+      </w:r>
+      <w:r>
+        <w:t>](https://portal.edirepository.org/nis/metadataviewer?packageid=edi.458.</w:t>
+      </w:r>
+      <w:r>
+        <w:t>9</w:t>
+      </w:r>
+      <w:r>
+        <w:t>)</w:t>
+      </w:r>
+    </w:p>
+    <w:p/>
+    <w:p>
+      <w:r>
+        <w:t>CDWR. 202</w:t>
+      </w:r>
+      <w:r>
+        <w:t>6</w:t>
+      </w:r>
+      <w:r>
+        <w:t xml:space="preserve">. Water Quality Evaluation Section, North Central Region Office. [https://wdl.water.ca.gov/waterdatalibrary/WaterQualityDataLib.aspx](https://wdl.water.ca.gov/waterdatalibrary/WaterQualityDataLib.aspx). </w:t>
+      </w:r>
+    </w:p>
+    <w:p/>
+    <w:p>
+      <w:r>
+        <w:t xml:space="preserve">Cloern, J. E., and T. S. Schraga. 2016. USGS Measurements of Water Quality in San Francisco Bay (CA), 1969-2015 (ver. </w:t>
+      </w:r>
+      <w:r>
+        <w:t>4</w:t>
+      </w:r>
+      <w:r>
+        <w:t xml:space="preserve">.0 </w:t>
+      </w:r>
+      <w:r>
+        <w:t xml:space="preserve">March </w:t>
+      </w:r>
+      <w:r>
+        <w:t>20</w:t>
+      </w:r>
+      <w:r>
+        <w:t>23</w:t>
+      </w:r>
+      <w:r>
+        <w:t>). U. S. Geological Survey data release.</w:t>
+      </w:r>
       <w:r>
         <w:t xml:space="preserve"> </w:t>
       </w:r>
       <w:r>
-        <w:t>9</w:t>
-      </w:r>
-      <w:r>
-        <w:t>. Environmental Data Initiative. [</w:t>
-      </w:r>
-      <w:r>
-        <w:t>doi:10.6073/pasta/a306956e3ebdc78348c2df8d05cd2</w:t>
-      </w:r>
-      <w:proofErr w:type="gramStart"/>
-      <w:r>
-        <w:t>ccb</w:t>
-      </w:r>
-      <w:r>
-        <w:t>](</w:t>
-      </w:r>
-      <w:proofErr w:type="gramEnd"/>
-      <w:r>
-        <w:t>https://portal.edirepository.org/nis/metadataviewer?packageid=edi.458.</w:t>
-      </w:r>
-      <w:r>
-        <w:t>9</w:t>
-      </w:r>
-      <w:r>
-        <w:t>)</w:t>
-      </w:r>
-    </w:p>
-    <w:p/>
-    <w:p>
-      <w:r>
-        <w:t>CDWR. 202</w:t>
-      </w:r>
-      <w:r>
-        <w:t>4</w:t>
-      </w:r>
-      <w:r>
-        <w:t>. Water Quality Evaluation Section, North Central Region Office. [</w:t>
-      </w:r>
-      <w:proofErr w:type="gramStart"/>
-      <w:r>
-        <w:t>https://wdl.water.ca.gov/waterdatalibrary/WaterQualityDataLib.aspx](</w:t>
-      </w:r>
-      <w:proofErr w:type="gramEnd"/>
-      <w:r>
-        <w:t xml:space="preserve">https://wdl.water.ca.gov/waterdatalibrary/WaterQualityDataLib.aspx). </w:t>
-      </w:r>
-    </w:p>
-    <w:p/>
-    <w:p>
-      <w:proofErr w:type="spellStart"/>
-      <w:r>
-        <w:t>Cloern</w:t>
-      </w:r>
-      <w:proofErr w:type="spellEnd"/>
-      <w:r>
-        <w:t xml:space="preserve">, J. E., and T. S. </w:t>
-      </w:r>
-      <w:proofErr w:type="spellStart"/>
-      <w:r>
-        <w:t>Schraga</w:t>
-      </w:r>
-      <w:proofErr w:type="spellEnd"/>
-      <w:r>
-        <w:t xml:space="preserve">. 2016. USGS Measurements of Water Quality in San Francisco Bay (CA), 1969-2015 (ver. </w:t>
-      </w:r>
-      <w:r>
-        <w:t>4</w:t>
-      </w:r>
-      <w:r>
-        <w:t xml:space="preserve">.0 </w:t>
-      </w:r>
-      <w:r>
-        <w:t xml:space="preserve">March </w:t>
-      </w:r>
-      <w:r>
-        <w:t>20</w:t>
-      </w:r>
-      <w:r>
-        <w:t>23</w:t>
-      </w:r>
-      <w:r>
-        <w:t>). U. S. Geological Survey data release.</w:t>
+        <w:t>https://doi.org/10.5066/F7TQ5ZPR</w:t>
+      </w:r>
+      <w:r>
+        <w:t>.</w:t>
+      </w:r>
+    </w:p>
+    <w:p/>
+    <w:p>
+      <w:r>
+        <w:t>Durand, J.R., T.O. O'Rear, and P.B. Moyle. 2025. UC Davis Suisun Marsh Fish Study, CA,</w:t>
       </w:r>
       <w:r>
         <w:t xml:space="preserve"> </w:t>
       </w:r>
       <w:r>
-        <w:t>https://doi.org/10.5066/F7TQ5ZPR</w:t>
+        <w:t xml:space="preserve">1980-2024 ver 1. Environmental Data Initiative. </w:t>
+      </w:r>
+      <w:r>
+        <w:t>https://doi.org/10.6073/pasta/8e83d00acabe9754bf87d39f7e18e476</w:t>
       </w:r>
       <w:r>
         <w:t>.</w:t>
@@ -1017,324 +884,121 @@
     <w:p/>
     <w:p>
       <w:r>
-        <w:t>Durand, J.R., T.O. O'Rear, and P.B. Moyle. 2025. UC Davis Suisun Marsh Fish Study, CA,</w:t>
+        <w:t>Hieb, K.A., J.M. Burns, and K. Soto. 2025. Interagency Ecological Program: San Francisco Bay Study Survey for Fish and Mobile Crustaceans 1980-2024 ver 2. Environmental Data Initiative. https://doi.org/10.6073/pasta/50dd4452a476db0aa3521ecdbb9a7a51.</w:t>
+      </w:r>
+    </w:p>
+    <w:p/>
+    <w:p>
+      <w:r>
+        <w:t>Interagency Ecological Program (IEP), S. Lesmeister, and J. Rinde. 2020. Interagency Ecological Program: Discrete dissolved oxygen monitoring in the Stockton Deep Water Ship Channel, collected by the Environmental Monitoring Program, 1997-2018 ver 2. Environmental Data Initiative. https://doi.org/10.6073/pasta/3268530c683726cd430c81894ffad768.</w:t>
+      </w:r>
+    </w:p>
+    <w:p/>
+    <w:p>
+      <w:r>
+        <w:t>Interagency Ecological Program (IEP), C. Brennan, V. Mora, J. Oceguera Zavala, and J.A. Jimenez. 2024. Interagency Ecological Program San Francisco Estuary 20-mm Survey 1995 - 2024 ver 5. Environmental Data Initiative. https://doi.org/10.6073/pasta/7b4dd8c7a63cf1b1ba345ad4b8f2f6f0.</w:t>
+      </w:r>
+    </w:p>
+    <w:p/>
+    <w:p>
+      <w:r>
+        <w:t>Interagency Ecological Program (IEP), L. Damon, and A. Chorazyczewski. 2021. Interagency Ecological Program San Francisco Estuary Spring Kodiak Trawl Survey 2002 - 2021 ver 4. Environmental Data Initiative. https://doi.org/10.6073/pasta/f0e2916f4a026f3f812a0855cee74a8d.</w:t>
+      </w:r>
+    </w:p>
+    <w:p/>
+    <w:p>
+      <w:r>
+        <w:t>Interagency Ecological Program (IEP), C. Brennan, V. Mora, J. Oceguera Zavala, and J.A. Jimenez. 2025. Interagency Ecological Program San Francisco Estuary Smelt Larva Survey 2009 – 2025 ver 11. Environmental Data Initiative. https://doi.org/10.6073/pasta/59ef680b5b172dcbcac0ff4be219dfa9.</w:t>
+      </w:r>
+    </w:p>
+    <w:p/>
+    <w:p>
+      <w:r>
+        <w:lastRenderedPageBreak/>
+        <w:t>Interagency Ecological Program, C. Pien, J. Adams, and N. Kwan. 2021. Interagency Ecological Program: Zooplankton catch and water quality data from the Sacramento River floodplain and tidal slough, collected by the Yolo Bypass Fish Monitoring Program, 1998-2018 ver 2. Environmental Data Initiative. https://doi.org/10.6073/pasta/baad532af96cba1d58d43b89c08ca081.</w:t>
+      </w:r>
+    </w:p>
+    <w:p/>
+    <w:p>
+      <w:r>
+        <w:t>Interagency Ecological Program, L. Vance, and N. Kwan. 2025. Interagency Ecological Program: Fish catch and water quality data from the Sacramento River floodplain and tidal slough, collected by the Yolo Bypass Fish Monitoring Program, 1998-2024. ver 5. Environmental Data Initiative. https://doi.org/10.6073/pasta/9eb0928f980e28f5df489eda4896b0da.</w:t>
+      </w:r>
+    </w:p>
+    <w:p/>
+    <w:p>
+      <w:r>
+        <w:t>Johnson, M.W., T.D. Rohlin, S.D. Breining-Aday, N.K. Ugbah, A. Rocha, S.B. Slater, T.D. Malinich, J.R. White, and C.E. Burdi. 2025. Interagency Ecological Program: Summer Townet Survey for Young Pelagic Fishes in the San Francisco Estuary ver 2. Environmental Data Initiative. https://doi.org/10.6073/pasta/e0807446886f7d04f71d1ca3e11ad6cb.</w:t>
+      </w:r>
+    </w:p>
+    <w:p/>
+    <w:p>
+      <w:r>
+        <w:t>Rohlin, T.D., M. Johnson, S. Breining-Aday, N. Ugbah, A. Rocha, J. White, T. Malinich, and S.B. Slater. 2025. Interagency Ecological Program: Fish catch and associated water quality for the Fall Midwater Trawl Survey, Sacramento-San Joaquin Delta, 1967-2024 ver 1. Environmental Data Initiative. https://doi.org/10.6073/pasta/fed40f5af0a5d5a6e54402cf78d3cbc6.</w:t>
+      </w:r>
+    </w:p>
+    <w:p/>
+    <w:p>
+      <w:r>
+        <w:t>Schraga, T. S., E. S. Nejad, C. A. Martin, and J. E. Cloern. 20</w:t>
+      </w:r>
+      <w:r>
+        <w:t>18</w:t>
+      </w:r>
+      <w:r>
+        <w:t xml:space="preserve">. USGS measurements of water quality in San Francisco Bay (CA), </w:t>
+      </w:r>
+      <w:r>
+        <w:t>2016-2021 (ver. 4.0, March 2023)</w:t>
+      </w:r>
+      <w:r>
+        <w:t>. U. S. Geological Survey data release. https://doi.org/10.5066/F7D21WGF</w:t>
+      </w:r>
+      <w:r>
+        <w:t>.</w:t>
+      </w:r>
+    </w:p>
+    <w:p/>
+    <w:p>
+      <w:r>
+        <w:t>Schultz, A. A. and A. J. Kalmbach. 2023. Directed Outflow Project Lower Trophic Study ver 4. Environmental Data Initiative. [doi:10.6073/pasta/86a01140eb3bb756ee9f7f8dab8aefc4](https://portal.edirepository.org/nis/metadataviewer?packageid=edi.1187.4).</w:t>
+      </w:r>
+    </w:p>
+    <w:p/>
+    <w:p>
+      <w:r>
+        <w:t>United States Fish and Wildlife Service, C. Macfarlane, D. Goodman, K. Erly, E. Huber, J. Cook, G. Bigham, V. Peck, S. Valdez, E. Louwerens, J. Speegle, T. Hope, G. Garcia, A. Arrambide, P. Higginson, and J. Falcon. 2025. Interagency Ecological Program and US Fish and Wildlife Service: San Francisco Estuary Enhanced Delta Smelt Monitoring Program Data, 2016-2024 ver 12. Environmental Data Initiative. https://doi.org/10.6073/pasta/ae279e24eef334ee43040e9e4e71941d.</w:t>
+      </w:r>
+    </w:p>
+    <w:p/>
+    <w:p>
+      <w:r>
+        <w:t>United States Fish and Wildlife Service, J. Speegle, J. Falcon, C. Macfarlane, K. Erly, S. Yun, A. Nanninga, and E. Huber. 2026. Interagency Ecological Program: Over four decades of juvenile fish monitoring data from the San Francisco Estuary, collected by the Delta Juvenile Fish Monitoring Program, 1976-2026 ver 17. Environmental Data Initiative.</w:t>
+      </w:r>
+    </w:p>
+    <w:p>
+      <w:r>
+        <w:t>https://doi.org/10.6073/pasta/c620f8300a051ed8d7037c1f0e046b7e</w:t>
+      </w:r>
+      <w:r>
+        <w:t>.</w:t>
+      </w:r>
+    </w:p>
+    <w:p/>
+    <w:p>
+      <w:r>
+        <w:t>U.S. Geological Survey. 2025. National Water Information System data available on the World Wide Web (USGS Water Data for the Nation), accessed July 14, 2025, at</w:t>
       </w:r>
       <w:r>
         <w:t xml:space="preserve"> </w:t>
       </w:r>
       <w:r>
-        <w:t xml:space="preserve">1980-2024 </w:t>
-      </w:r>
-      <w:proofErr w:type="spellStart"/>
-      <w:r>
-        <w:t>ver</w:t>
-      </w:r>
-      <w:proofErr w:type="spellEnd"/>
-      <w:r>
-        <w:t xml:space="preserve"> 1. Environmental Data Initiative. </w:t>
-      </w:r>
-      <w:r>
-        <w:t>https://doi.org/10.6073/pasta/8e83d00acabe9754bf87d39f7e18e476</w:t>
-      </w:r>
-      <w:r>
-        <w:t>.</w:t>
-      </w:r>
-    </w:p>
-    <w:p/>
-    <w:p>
-      <w:r>
-        <w:t xml:space="preserve">Hieb, K.A., J.M. Burns, and K. Soto. 2025. Interagency Ecological Program: San Francisco Bay Study Survey for Fish and Mobile Crustaceans 1980-2024 </w:t>
-      </w:r>
-      <w:proofErr w:type="spellStart"/>
-      <w:r>
-        <w:t>ver</w:t>
-      </w:r>
-      <w:proofErr w:type="spellEnd"/>
-      <w:r>
-        <w:t xml:space="preserve"> 2. Environmental Data Initiative. https://doi.org/10.6073/pasta/50dd4452a476db0aa3521ecdbb9a7a51.</w:t>
-      </w:r>
-    </w:p>
-    <w:p/>
-    <w:p>
-      <w:r>
-        <w:t xml:space="preserve">Interagency Ecological Program (IEP), S. Lesmeister, and J. Rinde. 2020. Interagency Ecological Program: Discrete dissolved oxygen monitoring in the Stockton Deep Water Ship Channel, collected by the Environmental Monitoring Program, 1997-2018 </w:t>
-      </w:r>
-      <w:proofErr w:type="spellStart"/>
-      <w:r>
-        <w:t>ver</w:t>
-      </w:r>
-      <w:proofErr w:type="spellEnd"/>
-      <w:r>
-        <w:t xml:space="preserve"> 2. Environmental Data Initiative. https://doi.org/10.6073/pasta/3268530c683726cd430c81894ffad768.</w:t>
-      </w:r>
-    </w:p>
-    <w:p/>
-    <w:p>
-      <w:r>
-        <w:t xml:space="preserve">Interagency Ecological Program (IEP), C. Brennan, V. Mora, J. Oceguera Zavala, and J.A. Jimenez. 2024. Interagency Ecological Program San Francisco Estuary 20-mm Survey 1995 - 2024 </w:t>
-      </w:r>
-      <w:proofErr w:type="spellStart"/>
-      <w:r>
-        <w:t>ver</w:t>
-      </w:r>
-      <w:proofErr w:type="spellEnd"/>
-      <w:r>
-        <w:t xml:space="preserve"> 5. Environmental Data Initiative. https://doi.org/10.6073/pasta/7b4dd8c7a63cf1b1ba345ad4b8f2f6f0.</w:t>
-      </w:r>
-    </w:p>
-    <w:p/>
-    <w:p>
-      <w:r>
-        <w:t xml:space="preserve">Interagency Ecological Program (IEP), L. Damon, and A. </w:t>
-      </w:r>
-      <w:proofErr w:type="spellStart"/>
-      <w:r>
-        <w:t>Chorazyczewski</w:t>
-      </w:r>
-      <w:proofErr w:type="spellEnd"/>
-      <w:r>
-        <w:t xml:space="preserve">. 2021. Interagency Ecological Program San Francisco Estuary Spring Kodiak Trawl Survey 2002 - 2021 </w:t>
-      </w:r>
-      <w:proofErr w:type="spellStart"/>
-      <w:r>
-        <w:t>ver</w:t>
-      </w:r>
-      <w:proofErr w:type="spellEnd"/>
-      <w:r>
-        <w:t xml:space="preserve"> 4. Environmental Data Initiative. https://doi.org/10.6073/pasta/f0e2916f4a026f3f812a0855cee74a8d.</w:t>
-      </w:r>
-    </w:p>
-    <w:p/>
-    <w:p>
-      <w:r>
-        <w:t xml:space="preserve">Interagency Ecological Program (IEP), C. Brennan, V. Mora, J. Oceguera Zavala, and J.A. Jimenez. 2025. Interagency Ecological Program San Francisco Estuary Smelt Larva Survey 2009 – 2025 </w:t>
-      </w:r>
-      <w:proofErr w:type="spellStart"/>
-      <w:r>
-        <w:t>ver</w:t>
-      </w:r>
-      <w:proofErr w:type="spellEnd"/>
-      <w:r>
-        <w:t xml:space="preserve"> 11. Environmental Data Initiative. https://doi.org/10.6073/pasta/59ef680b5b172dcbcac0ff4be219dfa9.</w:t>
-      </w:r>
-    </w:p>
-    <w:p/>
-    <w:p>
-      <w:r>
-        <w:lastRenderedPageBreak/>
-        <w:t xml:space="preserve">Interagency Ecological Program, C. Pien, J. Adams, and N. Kwan. 2021. Interagency Ecological Program: Zooplankton catch and water quality data from the Sacramento River floodplain and tidal slough, collected by the Yolo Bypass Fish Monitoring Program, 1998-2018 </w:t>
-      </w:r>
-      <w:proofErr w:type="spellStart"/>
-      <w:r>
-        <w:t>ver</w:t>
-      </w:r>
-      <w:proofErr w:type="spellEnd"/>
-      <w:r>
-        <w:t xml:space="preserve"> 2. Environmental Data Initiative. https://doi.org/10.6073/pasta/baad532af96cba1d58d43b89c08ca081.</w:t>
-      </w:r>
-    </w:p>
-    <w:p/>
-    <w:p>
-      <w:r>
-        <w:t xml:space="preserve">Interagency Ecological Program, L. Vance, and N. Kwan. 2025. Interagency Ecological Program: Fish catch and water quality data from the Sacramento River floodplain and tidal slough, collected by the Yolo Bypass Fish Monitoring Program, 1998-2024. </w:t>
-      </w:r>
-      <w:proofErr w:type="spellStart"/>
-      <w:r>
-        <w:t>ver</w:t>
-      </w:r>
-      <w:proofErr w:type="spellEnd"/>
-      <w:r>
-        <w:t xml:space="preserve"> 5. Environmental Data Initiative. https://doi.org/10.6073/pasta/9eb0928f980e28f5df489eda4896b0da.</w:t>
-      </w:r>
-    </w:p>
-    <w:p/>
-    <w:p>
-      <w:r>
-        <w:t xml:space="preserve">Johnson, M.W., T.D. Rohlin, S.D. Breining-Aday, N.K. </w:t>
-      </w:r>
-      <w:proofErr w:type="spellStart"/>
-      <w:r>
-        <w:t>Ugbah</w:t>
-      </w:r>
-      <w:proofErr w:type="spellEnd"/>
-      <w:r>
-        <w:t xml:space="preserve">, A. Rocha, S.B. Slater, T.D. Malinich, J.R. White, and C.E. Burdi. 2025. Interagency Ecological Program: Summer </w:t>
-      </w:r>
-      <w:proofErr w:type="spellStart"/>
-      <w:r>
-        <w:t>Townet</w:t>
-      </w:r>
-      <w:proofErr w:type="spellEnd"/>
-      <w:r>
-        <w:t xml:space="preserve"> Survey for Young Pelagic Fishes in the San Francisco Estuary </w:t>
-      </w:r>
-      <w:proofErr w:type="spellStart"/>
-      <w:r>
-        <w:t>ver</w:t>
-      </w:r>
-      <w:proofErr w:type="spellEnd"/>
-      <w:r>
-        <w:t xml:space="preserve"> 2. Environmental Data Initiative. https://doi.org/10.6073/pasta/e0807446886f7d04f71d1ca3e11ad6cb.</w:t>
-      </w:r>
-    </w:p>
-    <w:p/>
-    <w:p>
-      <w:r>
-        <w:t xml:space="preserve">Rohlin, T.D., M. Johnson, S. Breining-Aday, N. </w:t>
-      </w:r>
-      <w:proofErr w:type="spellStart"/>
-      <w:r>
-        <w:t>Ugbah</w:t>
-      </w:r>
-      <w:proofErr w:type="spellEnd"/>
-      <w:r>
-        <w:t xml:space="preserve">, A. Rocha, J. White, T. Malinich, and S.B. Slater. 2025. Interagency Ecological Program: Fish catch and associated water quality for the Fall Midwater Trawl Survey, Sacramento-San Joaquin Delta, 1967-2024 </w:t>
-      </w:r>
-      <w:proofErr w:type="spellStart"/>
-      <w:r>
-        <w:t>ver</w:t>
-      </w:r>
-      <w:proofErr w:type="spellEnd"/>
-      <w:r>
-        <w:t xml:space="preserve"> 1. Environmental Data Initiative. https://doi.org/10.6073/pasta/fed40f5af0a5d5a6e54402cf78d3cbc6.</w:t>
-      </w:r>
-    </w:p>
-    <w:p/>
-    <w:p>
-      <w:proofErr w:type="spellStart"/>
-      <w:r>
-        <w:t>Schraga</w:t>
-      </w:r>
-      <w:proofErr w:type="spellEnd"/>
-      <w:r>
-        <w:t xml:space="preserve">, T. S., E. S. Nejad, C. A. Martin, and J. E. </w:t>
-      </w:r>
-      <w:proofErr w:type="spellStart"/>
-      <w:r>
-        <w:t>Cloern</w:t>
-      </w:r>
-      <w:proofErr w:type="spellEnd"/>
-      <w:r>
-        <w:t>. 20</w:t>
-      </w:r>
-      <w:r>
-        <w:t>18</w:t>
-      </w:r>
-      <w:r>
-        <w:t xml:space="preserve">. USGS measurements of water quality in San Francisco Bay (CA), </w:t>
-      </w:r>
-      <w:r>
-        <w:t>2016-2021 (ver. 4.0, March 2023)</w:t>
-      </w:r>
-      <w:r>
-        <w:t>. U. S. Geological Survey data release. https://doi.org/10.5066/F7D21WGF</w:t>
-      </w:r>
-      <w:r>
-        <w:t>.</w:t>
-      </w:r>
-    </w:p>
-    <w:p/>
-    <w:p>
-      <w:r>
-        <w:t xml:space="preserve">Schultz, A. A. and A. J. Kalmbach. 2023. Directed Outflow Project Lower Trophic Study </w:t>
-      </w:r>
-      <w:proofErr w:type="spellStart"/>
-      <w:r>
-        <w:t>ver</w:t>
-      </w:r>
-      <w:proofErr w:type="spellEnd"/>
-      <w:r>
-        <w:t xml:space="preserve"> 4. Environmental Data Initiative. [doi:10.6073/pasta/86a01140eb3bb756ee9f7f8dab8aefc</w:t>
-      </w:r>
-      <w:proofErr w:type="gramStart"/>
-      <w:r>
-        <w:t>4](</w:t>
-      </w:r>
-      <w:proofErr w:type="gramEnd"/>
-      <w:r>
-        <w:t>https://portal.edirepository.org/nis/metadataviewer?packageid=edi.1187.4).</w:t>
-      </w:r>
-    </w:p>
-    <w:p/>
-    <w:p>
-      <w:r>
-        <w:t xml:space="preserve">United States Fish and Wildlife Service, C. Macfarlane, D. Goodman, K. Erly, E. Huber, J. Cook, G. Bigham, V. Peck, S. Valdez, E. </w:t>
-      </w:r>
-      <w:proofErr w:type="spellStart"/>
-      <w:r>
-        <w:t>Louwerens</w:t>
-      </w:r>
-      <w:proofErr w:type="spellEnd"/>
-      <w:r>
-        <w:t xml:space="preserve">, J. Speegle, T. Hope, G. Garcia, A. Arrambide, P. Higginson, and J. Falcon. 2025. Interagency Ecological Program and US Fish and Wildlife Service: San Francisco Estuary Enhanced Delta Smelt Monitoring Program Data, 2016-2024 </w:t>
-      </w:r>
-      <w:proofErr w:type="spellStart"/>
-      <w:r>
-        <w:t>ver</w:t>
-      </w:r>
-      <w:proofErr w:type="spellEnd"/>
-      <w:r>
-        <w:t xml:space="preserve"> 12. Environmental Data Initiative. https://doi.org/10.6073/pasta/ae279e24eef334ee43040e9e4e71941d.</w:t>
-      </w:r>
-    </w:p>
-    <w:p/>
-    <w:p>
-      <w:r>
-        <w:t>United States Fish and Wildlife Service, J. Speegle, J. Falcon, C. Macfarlane, K. Erly, S. Yun, A. Nanninga, and E. Huber. 2026.</w:t>
-      </w:r>
-      <w:r>
-        <w:t xml:space="preserve"> </w:t>
-      </w:r>
-      <w:r>
-        <w:t>Interagency Ecological Program: Over four decades of juvenile fish monitoring data from the San Francisco Estuary, collected by</w:t>
-      </w:r>
-      <w:r>
-        <w:t xml:space="preserve"> </w:t>
-      </w:r>
-      <w:r>
-        <w:t xml:space="preserve">the Delta Juvenile Fish Monitoring Program, 1976-2026 </w:t>
-      </w:r>
-      <w:proofErr w:type="spellStart"/>
-      <w:r>
-        <w:t>ver</w:t>
-      </w:r>
-      <w:proofErr w:type="spellEnd"/>
-      <w:r>
-        <w:t xml:space="preserve"> 17. Environmental Data Initiative.</w:t>
-      </w:r>
-    </w:p>
-    <w:p>
-      <w:r>
-        <w:t>https://doi.org/10.6073/pasta/c620f8300a051ed8d7037c1f0e046b7e</w:t>
-      </w:r>
-      <w:r>
-        <w:t>.</w:t>
-      </w:r>
-    </w:p>
-    <w:p/>
-    <w:p>
-      <w:r>
-        <w:t>U.S. Geological Survey. 2025. National Water Information System data available on the World Wide Web (USGS Water Data for the Nation), accessed July 14, 2025, at</w:t>
-      </w:r>
-      <w:r>
-        <w:t xml:space="preserve"> </w:t>
-      </w:r>
-      <w:r>
         <w:t>https://doi.org/10.5066/F7P55KJN</w:t>
       </w:r>
     </w:p>
     <w:p/>
     <w:p>
       <w:r>
-        <w:t>USBR, R. Dahlgren, L. Loken, and E. Van Nieuwenhuyse. 2020. Monthly vertical profiles of water quality in the Sacramento Deep Water Ship Channel 2012-2019. [</w:t>
-      </w:r>
-      <w:proofErr w:type="gramStart"/>
-      <w:r>
-        <w:t>https://www.usbr.gov/mp/bdo/index.html](</w:t>
-      </w:r>
-      <w:proofErr w:type="gramEnd"/>
-      <w:r>
-        <w:t>https://www.usbr.gov/mp/bdo/index.html)</w:t>
+        <w:t>USBR, R. Dahlgren, L. Loken, and E. Van Nieuwenhuyse. 2020. Monthly vertical profiles of water quality in the Sacramento Deep Water Ship Channel 2012-2019. [https://www.usbr.gov/mp/bdo/index.html](https://www.usbr.gov/mp/bdo/index.html)</w:t>
       </w:r>
     </w:p>
     <w:sectPr>

</xml_diff>